<commit_message>
feat: division bilateral de camas para Matsumoto (15 esq/l: 8/7) y Girasol (12 pl/l: 6/6) y actualizacion documental v1.1.0
</commit_message>
<xml_diff>
--- a/DOCUMENTACION_USUARIO.docx
+++ b/DOCUMENTACION_USUARIO.docx
@@ -1266,13 +1266,7 @@
         </w:rPr>
       </w:pPr>
       <w:r>
-        <w:rPr>
-          <w:rFonts w:ascii="Calibri" w:hAnsi="Calibri"/>
-          <w:color w:val="2E7D32"/>
-          <w:sz w:val="22"/>
-          <w:lang w:val="es-CO"/>
-        </w:rPr>
-        <w:t>4.1 Registro de Pompón y Cremón (Gestión de Clones y Sobredensidad)</w:t>
+        <w:t>4.1 Registro de Pompón, Cremón, Matsumoto y Girasol (Gestión de Clones y Sobredensidad)</w:t>
       </w:r>
     </w:p>
     <w:p>
@@ -1283,7 +1277,7 @@
         </w:rPr>
       </w:pPr>
       <w:r>
-        <w:t>En los cultivos de Pompón y Cremón, la labor física de siembra se organiza dividiendo cada cama en dos lados abordados simultáneamente por dos sembradores. La aplicación automatiza este cálculo con selectores especializados de alta precisión:</w:t>
+        <w:t>En los cultivos de Pompón, Cremón, Matsumoto y Girasol, la labor física de siembra se organiza dividiendo cada cama en dos lados abordados simultáneamente por dos sembradores. La aplicación automatiza este cálculo con selectores especializados de alta precisión:</w:t>
       </w:r>
     </w:p>
     <w:p>

</xml_diff>

<commit_message>
docs: actualizar manual de usuario con todas las imagenes en horizontal (landscape 2400x1080)
</commit_message>
<xml_diff>
--- a/DOCUMENTACION_USUARIO.docx
+++ b/DOCUMENTACION_USUARIO.docx
@@ -821,13 +821,13 @@
     <w:p>
       <w:pPr>
         <w:keepNext/>
-        <w:spacing w:before="120" w:after="40"/>
+        <w:spacing w:before="160" w:after="60"/>
         <w:jc w:val="center"/>
       </w:pPr>
       <w:r>
         <w:drawing>
           <wp:inline xmlns:a="http://schemas.openxmlformats.org/drawingml/2006/main" xmlns:pic="http://schemas.openxmlformats.org/drawingml/2006/picture">
-            <wp:extent cx="3017520" cy="6705600"/>
+            <wp:extent cx="5486400" cy="2468880"/>
             <wp:docPr id="1" name="Picture 1"/>
             <wp:cNvGraphicFramePr>
               <a:graphicFrameLocks noChangeAspect="1"/>
@@ -848,7 +848,7 @@
                   <pic:spPr>
                     <a:xfrm>
                       <a:off x="0" y="0"/>
-                      <a:ext cx="3017520" cy="6705600"/>
+                      <a:ext cx="5486400" cy="2468880"/>
                     </a:xfrm>
                     <a:prstGeom prst="rect"/>
                   </pic:spPr>
@@ -1094,13 +1094,13 @@
     <w:p>
       <w:pPr>
         <w:keepNext/>
-        <w:spacing w:before="120" w:after="40"/>
+        <w:spacing w:before="160" w:after="60"/>
         <w:jc w:val="center"/>
       </w:pPr>
       <w:r>
         <w:drawing>
           <wp:inline xmlns:a="http://schemas.openxmlformats.org/drawingml/2006/main" xmlns:pic="http://schemas.openxmlformats.org/drawingml/2006/picture">
-            <wp:extent cx="3017520" cy="6705600"/>
+            <wp:extent cx="5486400" cy="2468880"/>
             <wp:docPr id="2" name="Picture 2"/>
             <wp:cNvGraphicFramePr>
               <a:graphicFrameLocks noChangeAspect="1"/>
@@ -1121,7 +1121,7 @@
                   <pic:spPr>
                     <a:xfrm>
                       <a:off x="0" y="0"/>
-                      <a:ext cx="3017520" cy="6705600"/>
+                      <a:ext cx="5486400" cy="2468880"/>
                     </a:xfrm>
                     <a:prstGeom prst="rect"/>
                   </pic:spPr>
@@ -1311,13 +1311,13 @@
     <w:p>
       <w:pPr>
         <w:keepNext/>
-        <w:spacing w:before="120" w:after="40"/>
+        <w:spacing w:before="160" w:after="60"/>
         <w:jc w:val="center"/>
       </w:pPr>
       <w:r>
         <w:drawing>
           <wp:inline xmlns:a="http://schemas.openxmlformats.org/drawingml/2006/main" xmlns:pic="http://schemas.openxmlformats.org/drawingml/2006/picture">
-            <wp:extent cx="3017520" cy="6705600"/>
+            <wp:extent cx="5486400" cy="2468880"/>
             <wp:docPr id="3" name="Picture 3"/>
             <wp:cNvGraphicFramePr>
               <a:graphicFrameLocks noChangeAspect="1"/>
@@ -1338,7 +1338,7 @@
                   <pic:spPr>
                     <a:xfrm>
                       <a:off x="0" y="0"/>
-                      <a:ext cx="3017520" cy="6705600"/>
+                      <a:ext cx="5486400" cy="2468880"/>
                     </a:xfrm>
                     <a:prstGeom prst="rect"/>
                   </pic:spPr>
@@ -1476,13 +1476,13 @@
     <w:p>
       <w:pPr>
         <w:keepNext/>
-        <w:spacing w:before="120" w:after="40"/>
+        <w:spacing w:before="160" w:after="60"/>
         <w:jc w:val="center"/>
       </w:pPr>
       <w:r>
         <w:drawing>
           <wp:inline xmlns:a="http://schemas.openxmlformats.org/drawingml/2006/main" xmlns:pic="http://schemas.openxmlformats.org/drawingml/2006/picture">
-            <wp:extent cx="3017520" cy="6705600"/>
+            <wp:extent cx="5486400" cy="2468880"/>
             <wp:docPr id="4" name="Picture 4"/>
             <wp:cNvGraphicFramePr>
               <a:graphicFrameLocks noChangeAspect="1"/>
@@ -1503,7 +1503,7 @@
                   <pic:spPr>
                     <a:xfrm>
                       <a:off x="0" y="0"/>
-                      <a:ext cx="3017520" cy="6705600"/>
+                      <a:ext cx="5486400" cy="2468880"/>
                     </a:xfrm>
                     <a:prstGeom prst="rect"/>
                   </pic:spPr>
@@ -1588,13 +1588,13 @@
     <w:p>
       <w:pPr>
         <w:keepNext/>
-        <w:spacing w:before="120" w:after="40"/>
+        <w:spacing w:before="160" w:after="60"/>
         <w:jc w:val="center"/>
       </w:pPr>
       <w:r>
         <w:drawing>
           <wp:inline xmlns:a="http://schemas.openxmlformats.org/drawingml/2006/main" xmlns:pic="http://schemas.openxmlformats.org/drawingml/2006/picture">
-            <wp:extent cx="3017520" cy="6705600"/>
+            <wp:extent cx="5486400" cy="2468880"/>
             <wp:docPr id="5" name="Picture 5"/>
             <wp:cNvGraphicFramePr>
               <a:graphicFrameLocks noChangeAspect="1"/>
@@ -1615,7 +1615,7 @@
                   <pic:spPr>
                     <a:xfrm>
                       <a:off x="0" y="0"/>
-                      <a:ext cx="3017520" cy="6705600"/>
+                      <a:ext cx="5486400" cy="2468880"/>
                     </a:xfrm>
                     <a:prstGeom prst="rect"/>
                   </pic:spPr>
@@ -1812,13 +1812,13 @@
     <w:p>
       <w:pPr>
         <w:keepNext/>
-        <w:spacing w:before="120" w:after="40"/>
+        <w:spacing w:before="160" w:after="60"/>
         <w:jc w:val="center"/>
       </w:pPr>
       <w:r>
         <w:drawing>
           <wp:inline xmlns:a="http://schemas.openxmlformats.org/drawingml/2006/main" xmlns:pic="http://schemas.openxmlformats.org/drawingml/2006/picture">
-            <wp:extent cx="3017520" cy="6705600"/>
+            <wp:extent cx="5486400" cy="2468880"/>
             <wp:docPr id="6" name="Picture 6"/>
             <wp:cNvGraphicFramePr>
               <a:graphicFrameLocks noChangeAspect="1"/>
@@ -1839,7 +1839,7 @@
                   <pic:spPr>
                     <a:xfrm>
                       <a:off x="0" y="0"/>
-                      <a:ext cx="3017520" cy="6705600"/>
+                      <a:ext cx="5486400" cy="2468880"/>
                     </a:xfrm>
                     <a:prstGeom prst="rect"/>
                   </pic:spPr>
@@ -1927,13 +1927,13 @@
     <w:p>
       <w:pPr>
         <w:keepNext/>
-        <w:spacing w:before="120" w:after="40"/>
+        <w:spacing w:before="160" w:after="60"/>
         <w:jc w:val="center"/>
       </w:pPr>
       <w:r>
         <w:drawing>
           <wp:inline xmlns:a="http://schemas.openxmlformats.org/drawingml/2006/main" xmlns:pic="http://schemas.openxmlformats.org/drawingml/2006/picture">
-            <wp:extent cx="3017520" cy="6705600"/>
+            <wp:extent cx="5486400" cy="2468880"/>
             <wp:docPr id="7" name="Picture 7"/>
             <wp:cNvGraphicFramePr>
               <a:graphicFrameLocks noChangeAspect="1"/>
@@ -1954,7 +1954,7 @@
                   <pic:spPr>
                     <a:xfrm>
                       <a:off x="0" y="0"/>
-                      <a:ext cx="3017520" cy="6705600"/>
+                      <a:ext cx="5486400" cy="2468880"/>
                     </a:xfrm>
                     <a:prstGeom prst="rect"/>
                   </pic:spPr>
@@ -2126,13 +2126,13 @@
     <w:p>
       <w:pPr>
         <w:keepNext/>
-        <w:spacing w:before="120" w:after="40"/>
+        <w:spacing w:before="160" w:after="60"/>
         <w:jc w:val="center"/>
       </w:pPr>
       <w:r>
         <w:drawing>
           <wp:inline xmlns:a="http://schemas.openxmlformats.org/drawingml/2006/main" xmlns:pic="http://schemas.openxmlformats.org/drawingml/2006/picture">
-            <wp:extent cx="3017520" cy="6705600"/>
+            <wp:extent cx="5486400" cy="2468880"/>
             <wp:docPr id="8" name="Picture 8"/>
             <wp:cNvGraphicFramePr>
               <a:graphicFrameLocks noChangeAspect="1"/>
@@ -2153,7 +2153,7 @@
                   <pic:spPr>
                     <a:xfrm>
                       <a:off x="0" y="0"/>
-                      <a:ext cx="3017520" cy="6705600"/>
+                      <a:ext cx="5486400" cy="2468880"/>
                     </a:xfrm>
                     <a:prstGeom prst="rect"/>
                   </pic:spPr>
@@ -2232,13 +2232,13 @@
     <w:p>
       <w:pPr>
         <w:keepNext/>
-        <w:spacing w:before="120" w:after="40"/>
+        <w:spacing w:before="160" w:after="60"/>
         <w:jc w:val="center"/>
       </w:pPr>
       <w:r>
         <w:drawing>
           <wp:inline xmlns:a="http://schemas.openxmlformats.org/drawingml/2006/main" xmlns:pic="http://schemas.openxmlformats.org/drawingml/2006/picture">
-            <wp:extent cx="3017520" cy="6705600"/>
+            <wp:extent cx="5486400" cy="2468880"/>
             <wp:docPr id="9" name="Picture 9"/>
             <wp:cNvGraphicFramePr>
               <a:graphicFrameLocks noChangeAspect="1"/>
@@ -2259,7 +2259,7 @@
                   <pic:spPr>
                     <a:xfrm>
                       <a:off x="0" y="0"/>
-                      <a:ext cx="3017520" cy="6705600"/>
+                      <a:ext cx="5486400" cy="2468880"/>
                     </a:xfrm>
                     <a:prstGeom prst="rect"/>
                   </pic:spPr>
@@ -2399,13 +2399,13 @@
     <w:p>
       <w:pPr>
         <w:keepNext/>
-        <w:spacing w:before="120" w:after="40"/>
+        <w:spacing w:before="160" w:after="60"/>
         <w:jc w:val="center"/>
       </w:pPr>
       <w:r>
         <w:drawing>
           <wp:inline xmlns:a="http://schemas.openxmlformats.org/drawingml/2006/main" xmlns:pic="http://schemas.openxmlformats.org/drawingml/2006/picture">
-            <wp:extent cx="3017520" cy="6705600"/>
+            <wp:extent cx="5486400" cy="2468880"/>
             <wp:docPr id="10" name="Picture 10"/>
             <wp:cNvGraphicFramePr>
               <a:graphicFrameLocks noChangeAspect="1"/>
@@ -2426,7 +2426,7 @@
                   <pic:spPr>
                     <a:xfrm>
                       <a:off x="0" y="0"/>
-                      <a:ext cx="3017520" cy="6705600"/>
+                      <a:ext cx="5486400" cy="2468880"/>
                     </a:xfrm>
                     <a:prstGeom prst="rect"/>
                   </pic:spPr>
@@ -2582,13 +2582,13 @@
     <w:p>
       <w:pPr>
         <w:keepNext/>
-        <w:spacing w:before="120" w:after="40"/>
+        <w:spacing w:before="160" w:after="60"/>
         <w:jc w:val="center"/>
       </w:pPr>
       <w:r>
         <w:drawing>
           <wp:inline xmlns:a="http://schemas.openxmlformats.org/drawingml/2006/main" xmlns:pic="http://schemas.openxmlformats.org/drawingml/2006/picture">
-            <wp:extent cx="3017520" cy="6705600"/>
+            <wp:extent cx="5486400" cy="2468880"/>
             <wp:docPr id="11" name="Picture 11"/>
             <wp:cNvGraphicFramePr>
               <a:graphicFrameLocks noChangeAspect="1"/>
@@ -2609,7 +2609,7 @@
                   <pic:spPr>
                     <a:xfrm>
                       <a:off x="0" y="0"/>
-                      <a:ext cx="3017520" cy="6705600"/>
+                      <a:ext cx="5486400" cy="2468880"/>
                     </a:xfrm>
                     <a:prstGeom prst="rect"/>
                   </pic:spPr>
@@ -2701,13 +2701,13 @@
     <w:p>
       <w:pPr>
         <w:keepNext/>
-        <w:spacing w:before="120" w:after="40"/>
+        <w:spacing w:before="160" w:after="60"/>
         <w:jc w:val="center"/>
       </w:pPr>
       <w:r>
         <w:drawing>
           <wp:inline xmlns:a="http://schemas.openxmlformats.org/drawingml/2006/main" xmlns:pic="http://schemas.openxmlformats.org/drawingml/2006/picture">
-            <wp:extent cx="3017520" cy="6705600"/>
+            <wp:extent cx="5486400" cy="2468880"/>
             <wp:docPr id="12" name="Picture 12"/>
             <wp:cNvGraphicFramePr>
               <a:graphicFrameLocks noChangeAspect="1"/>
@@ -2728,7 +2728,7 @@
                   <pic:spPr>
                     <a:xfrm>
                       <a:off x="0" y="0"/>
-                      <a:ext cx="3017520" cy="6705600"/>
+                      <a:ext cx="5486400" cy="2468880"/>
                     </a:xfrm>
                     <a:prstGeom prst="rect"/>
                   </pic:spPr>
@@ -2900,13 +2900,13 @@
     <w:p>
       <w:pPr>
         <w:keepNext/>
-        <w:spacing w:before="120" w:after="40"/>
+        <w:spacing w:before="160" w:after="60"/>
         <w:jc w:val="center"/>
       </w:pPr>
       <w:r>
         <w:drawing>
           <wp:inline xmlns:a="http://schemas.openxmlformats.org/drawingml/2006/main" xmlns:pic="http://schemas.openxmlformats.org/drawingml/2006/picture">
-            <wp:extent cx="3017520" cy="6705600"/>
+            <wp:extent cx="5486400" cy="2468880"/>
             <wp:docPr id="13" name="Picture 13"/>
             <wp:cNvGraphicFramePr>
               <a:graphicFrameLocks noChangeAspect="1"/>
@@ -2927,7 +2927,7 @@
                   <pic:spPr>
                     <a:xfrm>
                       <a:off x="0" y="0"/>
-                      <a:ext cx="3017520" cy="6705600"/>
+                      <a:ext cx="5486400" cy="2468880"/>
                     </a:xfrm>
                     <a:prstGeom prst="rect"/>
                   </pic:spPr>
@@ -3067,13 +3067,13 @@
     <w:p>
       <w:pPr>
         <w:keepNext/>
-        <w:spacing w:before="120" w:after="40"/>
+        <w:spacing w:before="160" w:after="60"/>
         <w:jc w:val="center"/>
       </w:pPr>
       <w:r>
         <w:drawing>
           <wp:inline xmlns:a="http://schemas.openxmlformats.org/drawingml/2006/main" xmlns:pic="http://schemas.openxmlformats.org/drawingml/2006/picture">
-            <wp:extent cx="3017520" cy="6705600"/>
+            <wp:extent cx="5486400" cy="2468880"/>
             <wp:docPr id="14" name="Picture 14"/>
             <wp:cNvGraphicFramePr>
               <a:graphicFrameLocks noChangeAspect="1"/>
@@ -3082,11 +3082,11 @@
               <a:graphicData uri="http://schemas.openxmlformats.org/drawingml/2006/picture">
                 <pic:pic>
                   <pic:nvPicPr>
-                    <pic:cNvPr id="0" name="12_ranking_rendimiento_podio.png"/>
+                    <pic:cNvPr id="0" name="11_panel_administracion.png"/>
                     <pic:cNvPicPr/>
                   </pic:nvPicPr>
                   <pic:blipFill>
-                    <a:blip r:embed="rId22"/>
+                    <a:blip r:embed="rId21"/>
                     <a:stretch>
                       <a:fillRect/>
                     </a:stretch>
@@ -3094,7 +3094,7 @@
                   <pic:spPr>
                     <a:xfrm>
                       <a:off x="0" y="0"/>
-                      <a:ext cx="3017520" cy="6705600"/>
+                      <a:ext cx="5486400" cy="2468880"/>
                     </a:xfrm>
                     <a:prstGeom prst="rect"/>
                   </pic:spPr>
@@ -3245,13 +3245,13 @@
     <w:p>
       <w:pPr>
         <w:keepNext/>
-        <w:spacing w:before="120" w:after="40"/>
+        <w:spacing w:before="160" w:after="60"/>
         <w:jc w:val="center"/>
       </w:pPr>
       <w:r>
         <w:drawing>
           <wp:inline xmlns:a="http://schemas.openxmlformats.org/drawingml/2006/main" xmlns:pic="http://schemas.openxmlformats.org/drawingml/2006/picture">
-            <wp:extent cx="3017520" cy="6705600"/>
+            <wp:extent cx="5486400" cy="2468880"/>
             <wp:docPr id="15" name="Picture 15"/>
             <wp:cNvGraphicFramePr>
               <a:graphicFrameLocks noChangeAspect="1"/>
@@ -3264,7 +3264,7 @@
                     <pic:cNvPicPr/>
                   </pic:nvPicPr>
                   <pic:blipFill>
-                    <a:blip r:embed="rId23"/>
+                    <a:blip r:embed="rId22"/>
                     <a:stretch>
                       <a:fillRect/>
                     </a:stretch>
@@ -3272,7 +3272,7 @@
                   <pic:spPr>
                     <a:xfrm>
                       <a:off x="0" y="0"/>
-                      <a:ext cx="3017520" cy="6705600"/>
+                      <a:ext cx="5486400" cy="2468880"/>
                     </a:xfrm>
                     <a:prstGeom prst="rect"/>
                   </pic:spPr>
@@ -3444,13 +3444,13 @@
     <w:p>
       <w:pPr>
         <w:keepNext/>
-        <w:spacing w:before="120" w:after="40"/>
+        <w:spacing w:before="160" w:after="60"/>
         <w:jc w:val="center"/>
       </w:pPr>
       <w:r>
         <w:drawing>
           <wp:inline xmlns:a="http://schemas.openxmlformats.org/drawingml/2006/main" xmlns:pic="http://schemas.openxmlformats.org/drawingml/2006/picture">
-            <wp:extent cx="3017520" cy="6705600"/>
+            <wp:extent cx="5486400" cy="2468880"/>
             <wp:docPr id="16" name="Picture 16"/>
             <wp:cNvGraphicFramePr>
               <a:graphicFrameLocks noChangeAspect="1"/>
@@ -3463,7 +3463,7 @@
                     <pic:cNvPicPr/>
                   </pic:nvPicPr>
                   <pic:blipFill>
-                    <a:blip r:embed="rId24"/>
+                    <a:blip r:embed="rId23"/>
                     <a:stretch>
                       <a:fillRect/>
                     </a:stretch>
@@ -3471,7 +3471,7 @@
                   <pic:spPr>
                     <a:xfrm>
                       <a:off x="0" y="0"/>
-                      <a:ext cx="3017520" cy="6705600"/>
+                      <a:ext cx="5486400" cy="2468880"/>
                     </a:xfrm>
                     <a:prstGeom prst="rect"/>
                   </pic:spPr>

</xml_diff>